<commit_message>
Repository Cleaning Before getting DOI: 1
</commit_message>
<xml_diff>
--- a/ms/Isocline_ms_v8.7.docx
+++ b/ms/Isocline_ms_v8.7.docx
@@ -277,15 +277,19 @@
     </w:p>
     <w:p>
       <w:r>
-        <w:t xml:space="preserve">Data associated with the manuscript will be archived in the </w:t>
-      </w:r>
-      <w:proofErr w:type="spellStart"/>
-      <w:r>
-        <w:t>Zenodo</w:t>
-      </w:r>
-      <w:proofErr w:type="spellEnd"/>
-      <w:r>
-        <w:t xml:space="preserve"> public repository should the manuscript be accepted. R scripts for analyses are archived in a Git Hub repository.</w:t>
+        <w:t>Data associated with the manuscript will be archived in the Zenodo public repository should the manuscript be accepted. R scripts for analyses are archived in a Git Hub repository</w:t>
+      </w:r>
+      <w:r>
+        <w:t xml:space="preserve"> (</w:t>
+      </w:r>
+      <w:r>
+        <w:t>https://github.com/nbarrus1/Pomacea_Isocline.git</w:t>
+      </w:r>
+      <w:r>
+        <w:t>)</w:t>
+      </w:r>
+      <w:r>
+        <w:t>.</w:t>
       </w:r>
     </w:p>
     <w:p>
@@ -2028,16 +2032,11 @@
         <w:t xml:space="preserve"> </w:t>
       </w:r>
       <w:r>
-        <w:t xml:space="preserve">For these examples the specific </w:t>
-      </w:r>
-      <w:proofErr w:type="gramStart"/>
-      <w:r>
-        <w:t>isocline</w:t>
+        <w:t>For these examples the specific isocline</w:t>
       </w:r>
       <w:r>
         <w:t>s</w:t>
       </w:r>
-      <w:proofErr w:type="gramEnd"/>
       <w:r>
         <w:t xml:space="preserve"> are </w:t>
       </w:r>
@@ -2051,7 +2050,13 @@
         <w:t xml:space="preserve"> but</w:t>
       </w:r>
       <w:r>
-        <w:t xml:space="preserve"> details of the recruitment or population growth are described in relevant ways to make the approach appropriate.</w:t>
+        <w:t xml:space="preserve"> details of </w:t>
+      </w:r>
+      <w:r>
+        <w:t>recruitment</w:t>
+      </w:r>
+      <w:r>
+        <w:t xml:space="preserve"> or population growth are described in relevant ways to make the approach appropriate.</w:t>
       </w:r>
       <w:r>
         <w:t xml:space="preserve"> </w:t>
@@ -2141,17 +2146,17 @@
         <w:t xml:space="preserve"> published literature </w:t>
       </w:r>
       <w:r>
-        <w:t xml:space="preserve">under the same framework we do </w:t>
+        <w:t xml:space="preserve">under the same framework we do not </w:t>
+      </w:r>
+      <w:r>
+        <w:t xml:space="preserve">intend </w:t>
+      </w:r>
+      <w:r>
+        <w:t xml:space="preserve">to </w:t>
       </w:r>
       <w:r>
         <w:lastRenderedPageBreak/>
-        <w:t xml:space="preserve">not </w:t>
-      </w:r>
-      <w:r>
-        <w:t xml:space="preserve">intend </w:t>
-      </w:r>
-      <w:r>
-        <w:t>to over-simplify the ecological details of recruitment</w:t>
+        <w:t>over-simplify the ecological details of recruitment</w:t>
       </w:r>
       <w:r>
         <w:t>,</w:t>
@@ -2666,21 +2671,12 @@
       <w:r>
         <w:t xml:space="preserve"> wolves (</w:t>
       </w:r>
-      <w:proofErr w:type="spellStart"/>
       <w:r>
         <w:rPr>
           <w:i/>
           <w:iCs/>
         </w:rPr>
-        <w:t>Canus</w:t>
-      </w:r>
-      <w:proofErr w:type="spellEnd"/>
-      <w:r>
-        <w:rPr>
-          <w:i/>
-          <w:iCs/>
-        </w:rPr>
-        <w:t xml:space="preserve"> </w:t>
+        <w:t xml:space="preserve">Canus </w:t>
       </w:r>
       <w:proofErr w:type="spellStart"/>
       <w:r>
@@ -3463,10 +3459,7 @@
         <w:t>e</w:t>
       </w:r>
       <w:r>
-        <w:t xml:space="preserve"> </w:t>
-      </w:r>
-      <w:r>
-        <w:t>identify theoretical combinations of juvenile-stage parameters predicting population stasis (λ = 1), growth (λ &gt; 1), or decline (λ &lt; 1)</w:t>
+        <w:t xml:space="preserve"> identify theoretical combinations of juvenile-stage parameters predicting population stasis (λ = 1), growth (λ &gt; 1), or decline (λ &lt; 1)</w:t>
       </w:r>
       <w:r>
         <w:t xml:space="preserve"> </w:t>
@@ -4563,17 +4556,8 @@
           <w:i/>
           <w:iCs/>
         </w:rPr>
-        <w:t xml:space="preserve"> </w:t>
-      </w:r>
-      <w:proofErr w:type="spellStart"/>
-      <w:r>
-        <w:rPr>
-          <w:i/>
-          <w:iCs/>
-        </w:rPr>
-        <w:t>bauri</w:t>
-      </w:r>
-      <w:proofErr w:type="spellEnd"/>
+        <w:t xml:space="preserve"> bauri</w:t>
+      </w:r>
       <w:r>
         <w:t>;</w:t>
       </w:r>
@@ -9720,14 +9704,9 @@
       <w:r>
         <w:t xml:space="preserve"> </w:t>
       </w:r>
-      <w:proofErr w:type="gramStart"/>
-      <w:r>
-        <w:t xml:space="preserve">necessary </w:t>
-      </w:r>
-      <w:r>
-        <w:t>delist</w:t>
-      </w:r>
-      <w:proofErr w:type="gramEnd"/>
+      <w:r>
+        <w:t>necessary to deliver</w:t>
+      </w:r>
       <w:r>
         <w:t xml:space="preserve"> the </w:t>
       </w:r>
@@ -10312,7 +10291,15 @@
         <w:fldChar w:fldCharType="end"/>
       </w:r>
       <w:r>
-        <w:t xml:space="preserve">. Our results build on this finding by indicating that TP can mediate the net community level effects of predators on recruitment in the field. Periphyton </w:t>
+        <w:t xml:space="preserve">. Our results build on this finding by indicating that TP can mediate </w:t>
+      </w:r>
+      <w:proofErr w:type="gramStart"/>
+      <w:r>
+        <w:t>the net</w:t>
+      </w:r>
+      <w:proofErr w:type="gramEnd"/>
+      <w:r>
+        <w:t xml:space="preserve"> community level effects of predators on recruitment in the field. Periphyton </w:t>
       </w:r>
       <w:r>
         <w:t>TP</w:t>
@@ -10791,7 +10778,15 @@
         <w:t xml:space="preserve"> populations</w:t>
       </w:r>
       <w:r>
-        <w:t>; Dorn and Cook 2015, Sinnickson and Dorn 2024)</w:t>
+        <w:t xml:space="preserve">; Dorn and Cook 2015, </w:t>
+      </w:r>
+      <w:proofErr w:type="spellStart"/>
+      <w:r>
+        <w:t>Sinnickson</w:t>
+      </w:r>
+      <w:proofErr w:type="spellEnd"/>
+      <w:r>
+        <w:t xml:space="preserve"> and Dorn 2024)</w:t>
       </w:r>
       <w:r>
         <w:t xml:space="preserve">. </w:t>
@@ -11060,10 +11055,18 @@
         <w:t>J. Sommer and E. Cline were instrumental in completing the fieldwork and maintaining the wetland hydrologic conditions.</w:t>
       </w:r>
       <w:r>
-        <w:t xml:space="preserve"> K. Buckman, S. Olayon, J. </w:t>
+        <w:t xml:space="preserve"> K. Buckman, S. </w:t>
       </w:r>
       <w:proofErr w:type="spellStart"/>
       <w:r>
+        <w:t>Olayon</w:t>
+      </w:r>
+      <w:proofErr w:type="spellEnd"/>
+      <w:r>
+        <w:t xml:space="preserve">, J. </w:t>
+      </w:r>
+      <w:proofErr w:type="spellStart"/>
+      <w:r>
         <w:t>Aymonin</w:t>
       </w:r>
       <w:proofErr w:type="spellEnd"/>
@@ -11088,7 +11091,15 @@
       </w:r>
       <w:proofErr w:type="gramEnd"/>
       <w:r>
-        <w:t>4600003950) and Florida International University (#4500</w:t>
+        <w:t xml:space="preserve">4600003950) and Florida International </w:t>
+      </w:r>
+      <w:proofErr w:type="gramStart"/>
+      <w:r>
+        <w:t>University (#</w:t>
+      </w:r>
+      <w:proofErr w:type="gramEnd"/>
+      <w:r>
+        <w:t>4500</w:t>
       </w:r>
       <w:r>
         <w:t>013351)</w:t>
@@ -11166,6 +11177,7 @@
         <w:pStyle w:val="Heading1"/>
       </w:pPr>
       <w:r>
+        <w:lastRenderedPageBreak/>
         <w:t>References</w:t>
       </w:r>
     </w:p>
@@ -11203,49 +11215,7 @@
         <w:rPr>
           <w:rFonts w:cs="Times New Roman"/>
         </w:rPr>
-        <w:t>Barrus, N. T., D. Drumheller, M. I. Cook, and N. J. Dorn. 2023. Life history responses of two co-occurring congeneric Apple Snails (</w:t>
-      </w:r>
-      <w:proofErr w:type="spellStart"/>
-      <w:r>
-        <w:rPr>
-          <w:rFonts w:cs="Times New Roman"/>
-        </w:rPr>
-        <w:t>Pomacea</w:t>
-      </w:r>
-      <w:proofErr w:type="spellEnd"/>
-      <w:r>
-        <w:rPr>
-          <w:rFonts w:cs="Times New Roman"/>
-        </w:rPr>
-        <w:t xml:space="preserve"> maculata and P. paludosa) to variation in water depth and </w:t>
-      </w:r>
-      <w:proofErr w:type="spellStart"/>
-      <w:r>
-        <w:rPr>
-          <w:rFonts w:cs="Times New Roman"/>
-        </w:rPr>
-        <w:t>metaphyton</w:t>
-      </w:r>
-      <w:proofErr w:type="spellEnd"/>
-      <w:r>
-        <w:rPr>
-          <w:rFonts w:cs="Times New Roman"/>
-        </w:rPr>
-        <w:t xml:space="preserve"> total phosphorus. </w:t>
-      </w:r>
-      <w:proofErr w:type="spellStart"/>
-      <w:r>
-        <w:rPr>
-          <w:rFonts w:cs="Times New Roman"/>
-        </w:rPr>
-        <w:t>Hydrobiologia</w:t>
-      </w:r>
-      <w:proofErr w:type="spellEnd"/>
-      <w:r>
-        <w:rPr>
-          <w:rFonts w:cs="Times New Roman"/>
-        </w:rPr>
-        <w:t xml:space="preserve"> 850:841–860.</w:t>
+        <w:t>Barrus, N. T., D. Drumheller, M. I. Cook, and N. J. Dorn. 2023. Life history responses of two co-occurring congeneric Apple Snails (Pomacea maculata and P. paludosa) to variation in water depth and metaphyton total phosphorus. Hydrobiologia 850:841–860.</w:t>
       </w:r>
     </w:p>
     <w:p>
@@ -11273,21 +11243,7 @@
         <w:rPr>
           <w:rFonts w:cs="Times New Roman"/>
         </w:rPr>
-        <w:t xml:space="preserve">Brannelly, L. A., M. E. B. Ohmer, V. Saenz, and C. L. Richards‐Zawacki. 2019. Effects of hydroperiod on growth, development, survival and immune </w:t>
-      </w:r>
-      <w:proofErr w:type="spellStart"/>
-      <w:r>
-        <w:rPr>
-          <w:rFonts w:cs="Times New Roman"/>
-        </w:rPr>
-        <w:t>defences</w:t>
-      </w:r>
-      <w:proofErr w:type="spellEnd"/>
-      <w:r>
-        <w:rPr>
-          <w:rFonts w:cs="Times New Roman"/>
-        </w:rPr>
-        <w:t xml:space="preserve"> in a temperate amphibian. Functional Ecology 33:1952–1961.</w:t>
+        <w:t>Brannelly, L. A., M. E. B. Ohmer, V. Saenz, and C. L. Richards‐Zawacki. 2019. Effects of hydroperiod on growth, development, survival and immune defences in a temperate amphibian. Functional Ecology 33:1952–1961.</w:t>
       </w:r>
     </w:p>
     <w:p>
@@ -11301,35 +11257,7 @@
         <w:rPr>
           <w:rFonts w:cs="Times New Roman"/>
         </w:rPr>
-        <w:t xml:space="preserve">Brice, E. M., E. J. Larsen, D. R. Stahler, and D. R. </w:t>
-      </w:r>
-      <w:proofErr w:type="spellStart"/>
-      <w:r>
-        <w:rPr>
-          <w:rFonts w:cs="Times New Roman"/>
-        </w:rPr>
-        <w:t>MacNulty</w:t>
-      </w:r>
-      <w:proofErr w:type="spellEnd"/>
-      <w:r>
-        <w:rPr>
-          <w:rFonts w:cs="Times New Roman"/>
-        </w:rPr>
-        <w:t xml:space="preserve">. 2024. The primacy of density‐mediated indirect effects in a community of wolves, elk, and aspen. Ecological </w:t>
-      </w:r>
-      <w:proofErr w:type="gramStart"/>
-      <w:r>
-        <w:rPr>
-          <w:rFonts w:cs="Times New Roman"/>
-        </w:rPr>
-        <w:t>Monographs:e</w:t>
-      </w:r>
-      <w:proofErr w:type="gramEnd"/>
-      <w:r>
-        <w:rPr>
-          <w:rFonts w:cs="Times New Roman"/>
-        </w:rPr>
-        <w:t>1627.</w:t>
+        <w:t>Brice, E. M., E. J. Larsen, D. R. Stahler, and D. R. MacNulty. 2024. The primacy of density‐mediated indirect effects in a community of wolves, elk, and aspen. Ecological Monographs:e1627.</w:t>
       </w:r>
     </w:p>
     <w:p>
@@ -11343,21 +11271,7 @@
         <w:rPr>
           <w:rFonts w:cs="Times New Roman"/>
         </w:rPr>
-        <w:t xml:space="preserve">Carlson, S. M., E. M. Olsen, and L. A. </w:t>
-      </w:r>
-      <w:proofErr w:type="spellStart"/>
-      <w:r>
-        <w:rPr>
-          <w:rFonts w:cs="Times New Roman"/>
-        </w:rPr>
-        <w:t>Vllestad</w:t>
-      </w:r>
-      <w:proofErr w:type="spellEnd"/>
-      <w:r>
-        <w:rPr>
-          <w:rFonts w:cs="Times New Roman"/>
-        </w:rPr>
-        <w:t>. 2008. Seasonal mortality and the effect of body size: a review and an empirical test using individual data on brown trout. Functional Ecology 22:663–673.</w:t>
+        <w:t>Carlson, S. M., E. M. Olsen, and L. A. Vllestad. 2008. Seasonal mortality and the effect of body size: a review and an empirical test using individual data on brown trout. Functional Ecology 22:663–673.</w:t>
       </w:r>
     </w:p>
     <w:p>
@@ -11400,49 +11314,7 @@
         <w:rPr>
           <w:rFonts w:cs="Times New Roman"/>
         </w:rPr>
-        <w:t xml:space="preserve">Darby, P. C., D. L. DeAngelis, S. S. </w:t>
-      </w:r>
-      <w:proofErr w:type="spellStart"/>
-      <w:r>
-        <w:rPr>
-          <w:rFonts w:cs="Times New Roman"/>
-        </w:rPr>
-        <w:t>Romañach</w:t>
-      </w:r>
-      <w:proofErr w:type="spellEnd"/>
-      <w:r>
-        <w:rPr>
-          <w:rFonts w:cs="Times New Roman"/>
-        </w:rPr>
-        <w:t xml:space="preserve">, K. </w:t>
-      </w:r>
-      <w:proofErr w:type="spellStart"/>
-      <w:r>
-        <w:rPr>
-          <w:rFonts w:cs="Times New Roman"/>
-        </w:rPr>
-        <w:t>Suir</w:t>
-      </w:r>
-      <w:proofErr w:type="spellEnd"/>
-      <w:r>
-        <w:rPr>
-          <w:rFonts w:cs="Times New Roman"/>
-        </w:rPr>
-        <w:t xml:space="preserve">, and J. </w:t>
-      </w:r>
-      <w:proofErr w:type="spellStart"/>
-      <w:r>
-        <w:rPr>
-          <w:rFonts w:cs="Times New Roman"/>
-        </w:rPr>
-        <w:t>Bridevaux</w:t>
-      </w:r>
-      <w:proofErr w:type="spellEnd"/>
-      <w:r>
-        <w:rPr>
-          <w:rFonts w:cs="Times New Roman"/>
-        </w:rPr>
-        <w:t>. 2015. Modeling apple snail population dynamics on the Everglades landscape. Landscape Ecology 30:1497–1510.</w:t>
+        <w:t>Darby, P. C., D. L. DeAngelis, S. S. Romañach, K. Suir, and J. Bridevaux. 2015. Modeling apple snail population dynamics on the Everglades landscape. Landscape Ecology 30:1497–1510.</w:t>
       </w:r>
     </w:p>
     <w:p>
@@ -11456,21 +11328,7 @@
         <w:rPr>
           <w:rFonts w:cs="Times New Roman"/>
         </w:rPr>
-        <w:t>Davidson, A. T., and N. J. Dorn. 2017. Life history traits determine the differential vulnerability of native and invasive apple snails (</w:t>
-      </w:r>
-      <w:proofErr w:type="spellStart"/>
-      <w:r>
-        <w:rPr>
-          <w:rFonts w:cs="Times New Roman"/>
-        </w:rPr>
-        <w:t>Pomacea</w:t>
-      </w:r>
-      <w:proofErr w:type="spellEnd"/>
-      <w:r>
-        <w:rPr>
-          <w:rFonts w:cs="Times New Roman"/>
-        </w:rPr>
-        <w:t xml:space="preserve"> spp.) to a shared juvenile-stage predator. Aquatic Ecology 51:331–341.</w:t>
+        <w:t>Davidson, A. T., and N. J. Dorn. 2017. Life history traits determine the differential vulnerability of native and invasive apple snails (Pomacea spp.) to a shared juvenile-stage predator. Aquatic Ecology 51:331–341.</w:t>
       </w:r>
     </w:p>
     <w:p>
@@ -11484,21 +11342,7 @@
         <w:rPr>
           <w:rFonts w:cs="Times New Roman"/>
         </w:rPr>
-        <w:t xml:space="preserve">Davidson, A. T., and N. J. Dorn. 2018. System productivity alters predator sorting of a size-structured mixed prey community. </w:t>
-      </w:r>
-      <w:proofErr w:type="spellStart"/>
-      <w:r>
-        <w:rPr>
-          <w:rFonts w:cs="Times New Roman"/>
-        </w:rPr>
-        <w:t>Oecologia</w:t>
-      </w:r>
-      <w:proofErr w:type="spellEnd"/>
-      <w:r>
-        <w:rPr>
-          <w:rFonts w:cs="Times New Roman"/>
-        </w:rPr>
-        <w:t xml:space="preserve"> 186:1101–1111.</w:t>
+        <w:t>Davidson, A. T., and N. J. Dorn. 2018. System productivity alters predator sorting of a size-structured mixed prey community. Oecologia 186:1101–1111.</w:t>
       </w:r>
     </w:p>
     <w:p>
@@ -11526,35 +11370,7 @@
         <w:rPr>
           <w:rFonts w:cs="Times New Roman"/>
         </w:rPr>
-        <w:t xml:space="preserve">Davidson, A. T., C. R. </w:t>
-      </w:r>
-      <w:proofErr w:type="spellStart"/>
-      <w:r>
-        <w:rPr>
-          <w:rFonts w:cs="Times New Roman"/>
-        </w:rPr>
-        <w:t>Stunkle</w:t>
-      </w:r>
-      <w:proofErr w:type="spellEnd"/>
-      <w:r>
-        <w:rPr>
-          <w:rFonts w:cs="Times New Roman"/>
-        </w:rPr>
-        <w:t xml:space="preserve">, J. T. Armstrong, E. A. Hamman, M. W. McCoy, and J. R. Vonesh. 2024. Warming and top‐down control of stage‐structured prey: Linking theory to patterns in natural systems. Ecology </w:t>
-      </w:r>
-      <w:proofErr w:type="gramStart"/>
-      <w:r>
-        <w:rPr>
-          <w:rFonts w:cs="Times New Roman"/>
-        </w:rPr>
-        <w:t>105:e</w:t>
-      </w:r>
-      <w:proofErr w:type="gramEnd"/>
-      <w:r>
-        <w:rPr>
-          <w:rFonts w:cs="Times New Roman"/>
-        </w:rPr>
-        <w:t>4213.</w:t>
+        <w:t>Davidson, A. T., C. R. Stunkle, J. T. Armstrong, E. A. Hamman, M. W. McCoy, and J. R. Vonesh. 2024. Warming and top‐down control of stage‐structured prey: Linking theory to patterns in natural systems. Ecology 105:e4213.</w:t>
       </w:r>
     </w:p>
     <w:p>
@@ -11568,21 +11384,7 @@
         <w:rPr>
           <w:rFonts w:cs="Times New Roman"/>
         </w:rPr>
-        <w:t xml:space="preserve">De </w:t>
-      </w:r>
-      <w:proofErr w:type="spellStart"/>
-      <w:r>
-        <w:rPr>
-          <w:rFonts w:cs="Times New Roman"/>
-        </w:rPr>
-        <w:t>Roos</w:t>
-      </w:r>
-      <w:proofErr w:type="spellEnd"/>
-      <w:r>
-        <w:rPr>
-          <w:rFonts w:cs="Times New Roman"/>
-        </w:rPr>
-        <w:t>, A. M., L. Persson, and E. McCauley. 2003. The influence of size‐dependent life‐history traits on the structure and dynamics of populations and communities. Ecology Letters 6:473–487.</w:t>
+        <w:t>De Roos, A. M., L. Persson, and E. McCauley. 2003. The influence of size‐dependent life‐history traits on the structure and dynamics of populations and communities. Ecology Letters 6:473–487.</w:t>
       </w:r>
     </w:p>
     <w:p>
@@ -11596,140 +11398,14 @@
         <w:rPr>
           <w:rFonts w:cs="Times New Roman"/>
         </w:rPr>
-        <w:t xml:space="preserve">Dougherty, L. R., F. Frost, M. I. Maenpaa, M. Rowe, B. J. Cole, R. Vasudeva, P. Pottier, E. </w:t>
-      </w:r>
-      <w:proofErr w:type="spellStart"/>
+        <w:t xml:space="preserve">Dougherty, L. R., F. Frost, M. I. Maenpaa, M. Rowe, B. J. Cole, R. Vasudeva, P. Pottier, E. Schultner, E. L. Macartney, I. Lindenbaum, J. L. Smith, P. Carazo, M. Graziano, H. Weaving, B. Canal Domenech, D. Berger, A. Meena, T. R. Bishop, D. W. A. Noble, P. </w:t>
+      </w:r>
       <w:r>
         <w:rPr>
           <w:rFonts w:cs="Times New Roman"/>
         </w:rPr>
-        <w:t>Schultner</w:t>
-      </w:r>
-      <w:proofErr w:type="spellEnd"/>
-      <w:r>
-        <w:rPr>
-          <w:rFonts w:cs="Times New Roman"/>
-        </w:rPr>
-        <w:t xml:space="preserve">, E. L. Macartney, I. Lindenbaum, J. L. Smith, P. Carazo, M. Graziano, H. Weaving, B. Canal Domenech, D. Berger, A. Meena, T. R. Bishop, D. W. A. Noble, P. </w:t>
-      </w:r>
-      <w:r>
-        <w:rPr>
-          <w:rFonts w:cs="Times New Roman"/>
-        </w:rPr>
         <w:lastRenderedPageBreak/>
-        <w:t xml:space="preserve">Simões, J. Baur, M. C. </w:t>
-      </w:r>
-      <w:proofErr w:type="spellStart"/>
-      <w:r>
-        <w:rPr>
-          <w:rFonts w:cs="Times New Roman"/>
-        </w:rPr>
-        <w:t>Breedveld</w:t>
-      </w:r>
-      <w:proofErr w:type="spellEnd"/>
-      <w:r>
-        <w:rPr>
-          <w:rFonts w:cs="Times New Roman"/>
-        </w:rPr>
-        <w:t xml:space="preserve">, E. I. Svensson, L. T. Lancaster, J. Ellers, A. N. De Nardo, M. A. Santos, S. A. Ramm, S. M. </w:t>
-      </w:r>
-      <w:proofErr w:type="spellStart"/>
-      <w:r>
-        <w:rPr>
-          <w:rFonts w:cs="Times New Roman"/>
-        </w:rPr>
-        <w:t>Drobniak</w:t>
-      </w:r>
-      <w:proofErr w:type="spellEnd"/>
-      <w:r>
-        <w:rPr>
-          <w:rFonts w:cs="Times New Roman"/>
-        </w:rPr>
-        <w:t xml:space="preserve">, M. </w:t>
-      </w:r>
-      <w:proofErr w:type="spellStart"/>
-      <w:r>
-        <w:rPr>
-          <w:rFonts w:cs="Times New Roman"/>
-        </w:rPr>
-        <w:t>Redana</w:t>
-      </w:r>
-      <w:proofErr w:type="spellEnd"/>
-      <w:r>
-        <w:rPr>
-          <w:rFonts w:cs="Times New Roman"/>
-        </w:rPr>
-        <w:t xml:space="preserve">, C. Tuni, N. </w:t>
-      </w:r>
-      <w:proofErr w:type="spellStart"/>
-      <w:r>
-        <w:rPr>
-          <w:rFonts w:cs="Times New Roman"/>
-        </w:rPr>
-        <w:t>Pilakouta</w:t>
-      </w:r>
-      <w:proofErr w:type="spellEnd"/>
-      <w:r>
-        <w:rPr>
-          <w:rFonts w:cs="Times New Roman"/>
-        </w:rPr>
-        <w:t xml:space="preserve">, Z. V. </w:t>
-      </w:r>
-      <w:proofErr w:type="spellStart"/>
-      <w:r>
-        <w:rPr>
-          <w:rFonts w:cs="Times New Roman"/>
-        </w:rPr>
-        <w:t>Zizzari</w:t>
-      </w:r>
-      <w:proofErr w:type="spellEnd"/>
-      <w:r>
-        <w:rPr>
-          <w:rFonts w:cs="Times New Roman"/>
-        </w:rPr>
-        <w:t xml:space="preserve">, G. Iossa, S. </w:t>
-      </w:r>
-      <w:proofErr w:type="spellStart"/>
-      <w:r>
-        <w:rPr>
-          <w:rFonts w:cs="Times New Roman"/>
-        </w:rPr>
-        <w:t>Lüpold</w:t>
-      </w:r>
-      <w:proofErr w:type="spellEnd"/>
-      <w:r>
-        <w:rPr>
-          <w:rFonts w:cs="Times New Roman"/>
-        </w:rPr>
-        <w:t xml:space="preserve">, M. </w:t>
-      </w:r>
-      <w:proofErr w:type="spellStart"/>
-      <w:r>
-        <w:rPr>
-          <w:rFonts w:cs="Times New Roman"/>
-        </w:rPr>
-        <w:t>Koppik</w:t>
-      </w:r>
-      <w:proofErr w:type="spellEnd"/>
-      <w:r>
-        <w:rPr>
-          <w:rFonts w:cs="Times New Roman"/>
-        </w:rPr>
-        <w:t xml:space="preserve">, R. Early, C. Gasparini, S. Nakagawa, M. </w:t>
-      </w:r>
-      <w:proofErr w:type="spellStart"/>
-      <w:r>
-        <w:rPr>
-          <w:rFonts w:cs="Times New Roman"/>
-        </w:rPr>
-        <w:t>Lagisz</w:t>
-      </w:r>
-      <w:proofErr w:type="spellEnd"/>
-      <w:r>
-        <w:rPr>
-          <w:rFonts w:cs="Times New Roman"/>
-        </w:rPr>
-        <w:t>, A. Bretman, C. Fricke, R. R. Snook, and T. A. R. Price. 2024. A systematic map of studies testing the relationship between temperature and animal reproduction. Ecological Solutions and Evidence 5:1–17.</w:t>
+        <w:t>Simões, J. Baur, M. C. Breedveld, E. I. Svensson, L. T. Lancaster, J. Ellers, A. N. De Nardo, M. A. Santos, S. A. Ramm, S. M. Drobniak, M. Redana, C. Tuni, N. Pilakouta, Z. V. Zizzari, G. Iossa, S. Lüpold, M. Koppik, R. Early, C. Gasparini, S. Nakagawa, M. Lagisz, A. Bretman, C. Fricke, R. R. Snook, and T. A. R. Price. 2024. A systematic map of studies testing the relationship between temperature and animal reproduction. Ecological Solutions and Evidence 5:1–17.</w:t>
       </w:r>
     </w:p>
     <w:p>
@@ -11757,21 +11433,7 @@
         <w:rPr>
           <w:rFonts w:cs="Times New Roman"/>
         </w:rPr>
-        <w:t xml:space="preserve">Gaiser, E. E., P. V. McCormick, S. E. </w:t>
-      </w:r>
-      <w:proofErr w:type="spellStart"/>
-      <w:r>
-        <w:rPr>
-          <w:rFonts w:cs="Times New Roman"/>
-        </w:rPr>
-        <w:t>Hagerthey</w:t>
-      </w:r>
-      <w:proofErr w:type="spellEnd"/>
-      <w:r>
-        <w:rPr>
-          <w:rFonts w:cs="Times New Roman"/>
-        </w:rPr>
-        <w:t>, and A. D. Gottlieb. 2011. Landscape Patterns of Periphyton in the Florida Everglades. Critical Reviews in Environmental Science and Technology 41:92–120.</w:t>
+        <w:t>Gaiser, E. E., P. V. McCormick, S. E. Hagerthey, and A. D. Gottlieb. 2011. Landscape Patterns of Periphyton in the Florida Everglades. Critical Reviews in Environmental Science and Technology 41:92–120.</w:t>
       </w:r>
     </w:p>
     <w:p>
@@ -11799,21 +11461,7 @@
         <w:rPr>
           <w:rFonts w:cs="Times New Roman"/>
         </w:rPr>
-        <w:t xml:space="preserve">Gutierre, Darby, Valentine-Darby, Mellow, Therrien, and Watford. 2019. Contrasting Patterns of </w:t>
-      </w:r>
-      <w:proofErr w:type="spellStart"/>
-      <w:r>
-        <w:rPr>
-          <w:rFonts w:cs="Times New Roman"/>
-        </w:rPr>
-        <w:t>Pomacea</w:t>
-      </w:r>
-      <w:proofErr w:type="spellEnd"/>
-      <w:r>
-        <w:rPr>
-          <w:rFonts w:cs="Times New Roman"/>
-        </w:rPr>
-        <w:t xml:space="preserve"> maculata Establishment and Dispersal in an Everglades Wetland Unit and a Central Florida Lake. Diversity 11:1–20.</w:t>
+        <w:t>Gutierre, Darby, Valentine-Darby, Mellow, Therrien, and Watford. 2019. Contrasting Patterns of Pomacea maculata Establishment and Dispersal in an Everglades Wetland Unit and a Central Florida Lake. Diversity 11:1–20.</w:t>
       </w:r>
     </w:p>
     <w:p>
@@ -11827,49 +11475,7 @@
         <w:rPr>
           <w:rFonts w:cs="Times New Roman"/>
         </w:rPr>
-        <w:t xml:space="preserve">Hanning, G. W. 1979. Aspects of Reproduction in </w:t>
-      </w:r>
-      <w:proofErr w:type="spellStart"/>
-      <w:r>
-        <w:rPr>
-          <w:rFonts w:cs="Times New Roman"/>
-        </w:rPr>
-        <w:t>Pomacea</w:t>
-      </w:r>
-      <w:proofErr w:type="spellEnd"/>
-      <w:r>
-        <w:rPr>
-          <w:rFonts w:cs="Times New Roman"/>
-        </w:rPr>
-        <w:t xml:space="preserve"> paludosa (</w:t>
-      </w:r>
-      <w:proofErr w:type="spellStart"/>
-      <w:r>
-        <w:rPr>
-          <w:rFonts w:cs="Times New Roman"/>
-        </w:rPr>
-        <w:t>Mesogastropoda</w:t>
-      </w:r>
-      <w:proofErr w:type="spellEnd"/>
-      <w:r>
-        <w:rPr>
-          <w:rFonts w:cs="Times New Roman"/>
-        </w:rPr>
-        <w:t xml:space="preserve">: </w:t>
-      </w:r>
-      <w:proofErr w:type="spellStart"/>
-      <w:r>
-        <w:rPr>
-          <w:rFonts w:cs="Times New Roman"/>
-        </w:rPr>
-        <w:t>Pilidae</w:t>
-      </w:r>
-      <w:proofErr w:type="spellEnd"/>
-      <w:r>
-        <w:rPr>
-          <w:rFonts w:cs="Times New Roman"/>
-        </w:rPr>
-        <w:t>). Florida State University, Tallahassee FL.</w:t>
+        <w:t>Hanning, G. W. 1979. Aspects of Reproduction in Pomacea paludosa (Mesogastropoda: Pilidae). Florida State University, Tallahassee FL.</w:t>
       </w:r>
     </w:p>
     <w:p>
@@ -11883,21 +11489,7 @@
         <w:rPr>
           <w:rFonts w:cs="Times New Roman"/>
         </w:rPr>
-        <w:t xml:space="preserve">Hansen, C., S. Newman, C. J. Saunders, E. K. Tate-Boldt, and N. J. Dorn. 2022. Flow-mediated growth of an aquatic herbivore. </w:t>
-      </w:r>
-      <w:proofErr w:type="spellStart"/>
-      <w:r>
-        <w:rPr>
-          <w:rFonts w:cs="Times New Roman"/>
-        </w:rPr>
-        <w:t>Hydrobiologia</w:t>
-      </w:r>
-      <w:proofErr w:type="spellEnd"/>
-      <w:r>
-        <w:rPr>
-          <w:rFonts w:cs="Times New Roman"/>
-        </w:rPr>
-        <w:t xml:space="preserve"> 849:3161–3173.</w:t>
+        <w:t>Hansen, C., S. Newman, C. J. Saunders, E. K. Tate-Boldt, and N. J. Dorn. 2022. Flow-mediated growth of an aquatic herbivore. Hydrobiologia 849:3161–3173.</w:t>
       </w:r>
     </w:p>
     <w:p>
@@ -11907,20 +11499,12 @@
           <w:rFonts w:cs="Times New Roman"/>
         </w:rPr>
       </w:pPr>
-      <w:proofErr w:type="spellStart"/>
       <w:r>
         <w:rPr>
           <w:rFonts w:cs="Times New Roman"/>
         </w:rPr>
         <w:lastRenderedPageBreak/>
-        <w:t>Jeyasingh</w:t>
-      </w:r>
-      <w:proofErr w:type="spellEnd"/>
-      <w:r>
-        <w:rPr>
-          <w:rFonts w:cs="Times New Roman"/>
-        </w:rPr>
-        <w:t xml:space="preserve">, P. D., and L. J. Weider. 2005. Phosphorus availability mediates plasticity in life-history traits and predator-prey interactions in </w:t>
+        <w:t xml:space="preserve">Jeyasingh, P. D., and L. J. Weider. 2005. Phosphorus availability mediates plasticity in life-history traits and predator-prey interactions in </w:t>
       </w:r>
       <w:r>
         <w:rPr>
@@ -11962,49 +11546,7 @@
         <w:rPr>
           <w:rFonts w:cs="Times New Roman"/>
         </w:rPr>
-        <w:t xml:space="preserve">Kesler, D. H., and W. R. Munns. 1989. Predation by </w:t>
-      </w:r>
-      <w:proofErr w:type="spellStart"/>
-      <w:r>
-        <w:rPr>
-          <w:rFonts w:cs="Times New Roman"/>
-        </w:rPr>
-        <w:t>Belostoma</w:t>
-      </w:r>
-      <w:proofErr w:type="spellEnd"/>
-      <w:r>
-        <w:rPr>
-          <w:rFonts w:cs="Times New Roman"/>
-        </w:rPr>
-        <w:t xml:space="preserve"> </w:t>
-      </w:r>
-      <w:proofErr w:type="spellStart"/>
-      <w:r>
-        <w:rPr>
-          <w:rFonts w:cs="Times New Roman"/>
-        </w:rPr>
-        <w:t>flumineum</w:t>
-      </w:r>
-      <w:proofErr w:type="spellEnd"/>
-      <w:r>
-        <w:rPr>
-          <w:rFonts w:cs="Times New Roman"/>
-        </w:rPr>
-        <w:t xml:space="preserve"> (Hemiptera): An Important Cause of Mortality in Freshwater Snails. Journal of the North American </w:t>
-      </w:r>
-      <w:proofErr w:type="spellStart"/>
-      <w:r>
-        <w:rPr>
-          <w:rFonts w:cs="Times New Roman"/>
-        </w:rPr>
-        <w:t>Benthological</w:t>
-      </w:r>
-      <w:proofErr w:type="spellEnd"/>
-      <w:r>
-        <w:rPr>
-          <w:rFonts w:cs="Times New Roman"/>
-        </w:rPr>
-        <w:t xml:space="preserve"> Society 8:342–350.</w:t>
+        <w:t>Kesler, D. H., and W. R. Munns. 1989. Predation by Belostoma flumineum (Hemiptera): An Important Cause of Mortality in Freshwater Snails. Journal of the North American Benthological Society 8:342–350.</w:t>
       </w:r>
     </w:p>
     <w:p>
@@ -12018,21 +11560,7 @@
         <w:rPr>
           <w:rFonts w:cs="Times New Roman"/>
         </w:rPr>
-        <w:t xml:space="preserve">Kimbro, D. L., B. S. Cheng, and E. D. </w:t>
-      </w:r>
-      <w:proofErr w:type="spellStart"/>
-      <w:r>
-        <w:rPr>
-          <w:rFonts w:cs="Times New Roman"/>
-        </w:rPr>
-        <w:t>Grosholz</w:t>
-      </w:r>
-      <w:proofErr w:type="spellEnd"/>
-      <w:r>
-        <w:rPr>
-          <w:rFonts w:cs="Times New Roman"/>
-        </w:rPr>
-        <w:t>. 2013. Biotic resistance in marine environments. Ecology Letters 16:821–833.</w:t>
+        <w:t>Kimbro, D. L., B. S. Cheng, and E. D. Grosholz. 2013. Biotic resistance in marine environments. Ecology Letters 16:821–833.</w:t>
       </w:r>
     </w:p>
     <w:p>
@@ -12088,35 +11616,7 @@
         <w:rPr>
           <w:rFonts w:cs="Times New Roman"/>
         </w:rPr>
-        <w:t xml:space="preserve">McVoy, C. W., W. P. Said, J. </w:t>
-      </w:r>
-      <w:proofErr w:type="spellStart"/>
-      <w:r>
-        <w:rPr>
-          <w:rFonts w:cs="Times New Roman"/>
-        </w:rPr>
-        <w:t>Obeyseker</w:t>
-      </w:r>
-      <w:proofErr w:type="spellEnd"/>
-      <w:r>
-        <w:rPr>
-          <w:rFonts w:cs="Times New Roman"/>
-        </w:rPr>
-        <w:t xml:space="preserve">, J. A. VanArman, and T. W. Dreschel. 2011. Landscapes and Hydrology of the </w:t>
-      </w:r>
-      <w:proofErr w:type="spellStart"/>
-      <w:r>
-        <w:rPr>
-          <w:rFonts w:cs="Times New Roman"/>
-        </w:rPr>
-        <w:t>Predrainage</w:t>
-      </w:r>
-      <w:proofErr w:type="spellEnd"/>
-      <w:r>
-        <w:rPr>
-          <w:rFonts w:cs="Times New Roman"/>
-        </w:rPr>
-        <w:t xml:space="preserve"> Everglades. University Press of Florida.</w:t>
+        <w:t>McVoy, C. W., W. P. Said, J. Obeyseker, J. A. VanArman, and T. W. Dreschel. 2011. Landscapes and Hydrology of the Predrainage Everglades. University Press of Florida.</w:t>
       </w:r>
     </w:p>
     <w:p>
@@ -12145,35 +11645,7 @@
         <w:rPr>
           <w:rFonts w:cs="Times New Roman"/>
         </w:rPr>
-        <w:t xml:space="preserve">Munroe, D., S. </w:t>
-      </w:r>
-      <w:proofErr w:type="spellStart"/>
-      <w:r>
-        <w:rPr>
-          <w:rFonts w:cs="Times New Roman"/>
-        </w:rPr>
-        <w:t>Borsetti</w:t>
-      </w:r>
-      <w:proofErr w:type="spellEnd"/>
-      <w:r>
-        <w:rPr>
-          <w:rFonts w:cs="Times New Roman"/>
-        </w:rPr>
-        <w:t xml:space="preserve">, K. Ashton-Alcox, and D. Bushek. 2017. Early Post-Settlement Growth in Wild Eastern Oyster (Crassostrea virginica </w:t>
-      </w:r>
-      <w:proofErr w:type="spellStart"/>
-      <w:r>
-        <w:rPr>
-          <w:rFonts w:cs="Times New Roman"/>
-        </w:rPr>
-        <w:t>Gemlin</w:t>
-      </w:r>
-      <w:proofErr w:type="spellEnd"/>
-      <w:r>
-        <w:rPr>
-          <w:rFonts w:cs="Times New Roman"/>
-        </w:rPr>
-        <w:t xml:space="preserve"> 1791) Populations. Estuaries and Coasts 40:880–888.</w:t>
+        <w:t>Munroe, D., S. Borsetti, K. Ashton-Alcox, and D. Bushek. 2017. Early Post-Settlement Growth in Wild Eastern Oyster (Crassostrea virginica Gemlin 1791) Populations. Estuaries and Coasts 40:880–888.</w:t>
       </w:r>
     </w:p>
     <w:p>
@@ -12201,49 +11673,7 @@
         <w:rPr>
           <w:rFonts w:cs="Times New Roman"/>
         </w:rPr>
-        <w:t xml:space="preserve">Nunes, L. T., D. R. </w:t>
-      </w:r>
-      <w:proofErr w:type="spellStart"/>
-      <w:r>
-        <w:rPr>
-          <w:rFonts w:cs="Times New Roman"/>
-        </w:rPr>
-        <w:t>Barneche</w:t>
-      </w:r>
-      <w:proofErr w:type="spellEnd"/>
-      <w:r>
-        <w:rPr>
-          <w:rFonts w:cs="Times New Roman"/>
-        </w:rPr>
-        <w:t xml:space="preserve">, N. S. </w:t>
-      </w:r>
-      <w:proofErr w:type="spellStart"/>
-      <w:r>
-        <w:rPr>
-          <w:rFonts w:cs="Times New Roman"/>
-        </w:rPr>
-        <w:t>Lastrucci</w:t>
-      </w:r>
-      <w:proofErr w:type="spellEnd"/>
-      <w:r>
-        <w:rPr>
-          <w:rFonts w:cs="Times New Roman"/>
-        </w:rPr>
-        <w:t xml:space="preserve">, A. A. Fraga, J. A. C. C. Nunes, C. </w:t>
-      </w:r>
-      <w:proofErr w:type="gramStart"/>
-      <w:r>
-        <w:rPr>
-          <w:rFonts w:cs="Times New Roman"/>
-        </w:rPr>
-        <w:t>E. L</w:t>
-      </w:r>
-      <w:proofErr w:type="gramEnd"/>
-      <w:r>
-        <w:rPr>
-          <w:rFonts w:cs="Times New Roman"/>
-        </w:rPr>
-        <w:t>. Ferreira, and S. R. Floeter. 2021. Predicting the effects of body size, temperature and diet on animal feeding rates. Functional Ecology 35:2229–2240.</w:t>
+        <w:t>Nunes, L. T., D. R. Barneche, N. S. Lastrucci, A. A. Fraga, J. A. C. C. Nunes, C. E. L. Ferreira, and S. R. Floeter. 2021. Predicting the effects of body size, temperature and diet on animal feeding rates. Functional Ecology 35:2229–2240.</w:t>
       </w:r>
     </w:p>
     <w:p>
@@ -12257,21 +11687,7 @@
         <w:rPr>
           <w:rFonts w:cs="Times New Roman"/>
         </w:rPr>
-        <w:t xml:space="preserve">O’Hare, N. K. 2010. </w:t>
-      </w:r>
-      <w:proofErr w:type="spellStart"/>
-      <w:r>
-        <w:rPr>
-          <w:rFonts w:cs="Times New Roman"/>
-        </w:rPr>
-        <w:t>Pomacea</w:t>
-      </w:r>
-      <w:proofErr w:type="spellEnd"/>
-      <w:r>
-        <w:rPr>
-          <w:rFonts w:cs="Times New Roman"/>
-        </w:rPr>
-        <w:t xml:space="preserve"> paludosa (Florida Apple Snail) Reproduction in Restored and Natural Seasonal Wetlands in the Everglades. Wetlands 30:1045–1052.</w:t>
+        <w:t>O’Hare, N. K. 2010. Pomacea paludosa (Florida Apple Snail) Reproduction in Restored and Natural Seasonal Wetlands in the Everglades. Wetlands 30:1045–1052.</w:t>
       </w:r>
     </w:p>
     <w:p>
@@ -12285,21 +11701,7 @@
         <w:rPr>
           <w:rFonts w:cs="Times New Roman"/>
         </w:rPr>
-        <w:t xml:space="preserve">Pepi, A., P. Grof-Tisza, M. Holyoak, and R. Karban. 2018. As temperature increases, predator attack </w:t>
-      </w:r>
-      <w:proofErr w:type="gramStart"/>
-      <w:r>
-        <w:rPr>
-          <w:rFonts w:cs="Times New Roman"/>
-        </w:rPr>
-        <w:t>rate is</w:t>
-      </w:r>
-      <w:proofErr w:type="gramEnd"/>
-      <w:r>
-        <w:rPr>
-          <w:rFonts w:cs="Times New Roman"/>
-        </w:rPr>
-        <w:t xml:space="preserve"> more important to survival than a smaller window of prey vulnerability. Ecology 99:1584–1590.</w:t>
+        <w:t>Pepi, A., P. Grof-Tisza, M. Holyoak, and R. Karban. 2018. As temperature increases, predator attack rate is more important to survival than a smaller window of prey vulnerability. Ecology 99:1584–1590.</w:t>
       </w:r>
     </w:p>
     <w:p>
@@ -12327,35 +11729,7 @@
         <w:rPr>
           <w:rFonts w:cs="Times New Roman"/>
         </w:rPr>
-        <w:t xml:space="preserve">Pöyry, J., R. Leinonen, G. Söderman, M. Nieminen, R. K. Heikkinen, and T. R. Carter. 2011. Climate-induced increase of moth </w:t>
-      </w:r>
-      <w:proofErr w:type="spellStart"/>
-      <w:r>
-        <w:rPr>
-          <w:rFonts w:cs="Times New Roman"/>
-        </w:rPr>
-        <w:t>multivoltinism</w:t>
-      </w:r>
-      <w:proofErr w:type="spellEnd"/>
-      <w:r>
-        <w:rPr>
-          <w:rFonts w:cs="Times New Roman"/>
-        </w:rPr>
-        <w:t xml:space="preserve"> in boreal regions: Climate-induced increase in moth </w:t>
-      </w:r>
-      <w:proofErr w:type="spellStart"/>
-      <w:r>
-        <w:rPr>
-          <w:rFonts w:cs="Times New Roman"/>
-        </w:rPr>
-        <w:t>multivoltinism</w:t>
-      </w:r>
-      <w:proofErr w:type="spellEnd"/>
-      <w:r>
-        <w:rPr>
-          <w:rFonts w:cs="Times New Roman"/>
-        </w:rPr>
-        <w:t>. Global Ecology and Biogeography 20:289–298.</w:t>
+        <w:t>Pöyry, J., R. Leinonen, G. Söderman, M. Nieminen, R. K. Heikkinen, and T. R. Carter. 2011. Climate-induced increase of moth multivoltinism in boreal regions: Climate-induced increase in moth multivoltinism. Global Ecology and Biogeography 20:289–298.</w:t>
       </w:r>
     </w:p>
     <w:p>
@@ -12370,21 +11744,7 @@
           <w:rFonts w:cs="Times New Roman"/>
         </w:rPr>
         <w:lastRenderedPageBreak/>
-        <w:t xml:space="preserve">Rice, J. A., T. J. Miller, K. A. Rose, L. B. Crowder, E. A. Marschall, A. S. </w:t>
-      </w:r>
-      <w:proofErr w:type="spellStart"/>
-      <w:r>
-        <w:rPr>
-          <w:rFonts w:cs="Times New Roman"/>
-        </w:rPr>
-        <w:t>Trebitz</w:t>
-      </w:r>
-      <w:proofErr w:type="spellEnd"/>
-      <w:r>
-        <w:rPr>
-          <w:rFonts w:cs="Times New Roman"/>
-        </w:rPr>
-        <w:t>, and D. L. DeAngelis. 1993. Growth Rate Variation and Larval Survival: Inferences from an Individual-Based Size-Dependent Predation Model. Canadian Journal of Fisheries and Aquatic Sciences 50:133–142.</w:t>
+        <w:t>Rice, J. A., T. J. Miller, K. A. Rose, L. B. Crowder, E. A. Marschall, A. S. Trebitz, and D. L. DeAngelis. 1993. Growth Rate Variation and Larval Survival: Inferences from an Individual-Based Size-Dependent Predation Model. Canadian Journal of Fisheries and Aquatic Sciences 50:133–142.</w:t>
       </w:r>
     </w:p>
     <w:p>
@@ -12454,21 +11814,7 @@
         <w:rPr>
           <w:rFonts w:cs="Times New Roman"/>
         </w:rPr>
-        <w:t xml:space="preserve">Ruetz, C. R., J. C. Trexler, F. Jordan, W. F. Loftus, and S. A. Perry. 2005. Population dynamics of wetland fishes: </w:t>
-      </w:r>
-      <w:proofErr w:type="spellStart"/>
-      <w:r>
-        <w:rPr>
-          <w:rFonts w:cs="Times New Roman"/>
-        </w:rPr>
-        <w:t>spatio</w:t>
-      </w:r>
-      <w:proofErr w:type="spellEnd"/>
-      <w:r>
-        <w:rPr>
-          <w:rFonts w:cs="Times New Roman"/>
-        </w:rPr>
-        <w:t>‐temporal patterns synchronized by hydrological disturbance? Journal of Animal Ecology 74:322–332.</w:t>
+        <w:t>Ruetz, C. R., J. C. Trexler, F. Jordan, W. F. Loftus, and S. A. Perry. 2005. Population dynamics of wetland fishes: spatio‐temporal patterns synchronized by hydrological disturbance? Journal of Animal Ecology 74:322–332.</w:t>
       </w:r>
     </w:p>
     <w:p>
@@ -12478,21 +11824,12 @@
           <w:rFonts w:cs="Times New Roman"/>
         </w:rPr>
       </w:pPr>
-      <w:proofErr w:type="spellStart"/>
       <w:r>
         <w:rPr>
           <w:rFonts w:cs="Times New Roman"/>
         </w:rPr>
-        <w:t>Schmera</w:t>
-      </w:r>
-      <w:proofErr w:type="spellEnd"/>
-      <w:r>
-        <w:rPr>
-          <w:rFonts w:cs="Times New Roman"/>
-        </w:rPr>
-        <w:t xml:space="preserve">, D., A. Baur, and B. Baur. 2015. Size-dependent shell growth and survival in natural populations of the rock-dwelling land snail </w:t>
-      </w:r>
-      <w:proofErr w:type="spellStart"/>
+        <w:t xml:space="preserve">Schmera, D., A. Baur, and B. Baur. 2015. Size-dependent shell growth and survival in natural populations of the rock-dwelling land snail </w:t>
+      </w:r>
       <w:r>
         <w:rPr>
           <w:rFonts w:cs="Times New Roman"/>
@@ -12501,14 +11838,12 @@
         </w:rPr>
         <w:t>Chondrina</w:t>
       </w:r>
-      <w:proofErr w:type="spellEnd"/>
       <w:r>
         <w:rPr>
           <w:rFonts w:cs="Times New Roman"/>
         </w:rPr>
         <w:t xml:space="preserve"> </w:t>
       </w:r>
-      <w:proofErr w:type="spellStart"/>
       <w:r>
         <w:rPr>
           <w:rFonts w:cs="Times New Roman"/>
@@ -12517,7 +11852,6 @@
         </w:rPr>
         <w:t>clienta</w:t>
       </w:r>
-      <w:proofErr w:type="spellEnd"/>
       <w:r>
         <w:rPr>
           <w:rFonts w:cs="Times New Roman"/>
@@ -12536,35 +11870,7 @@
         <w:rPr>
           <w:rFonts w:cs="Times New Roman"/>
         </w:rPr>
-        <w:t xml:space="preserve">Sklar, F. H., M. J. Chimney, S. Newman, P. McCormick, D. Gawlik, S. Miao, C. McVoy, W. Said, J. Newman, C. Coronado, G. Crozier, M. </w:t>
-      </w:r>
-      <w:proofErr w:type="spellStart"/>
-      <w:r>
-        <w:rPr>
-          <w:rFonts w:cs="Times New Roman"/>
-        </w:rPr>
-        <w:t>Korvela</w:t>
-      </w:r>
-      <w:proofErr w:type="spellEnd"/>
-      <w:r>
-        <w:rPr>
-          <w:rFonts w:cs="Times New Roman"/>
-        </w:rPr>
-        <w:t xml:space="preserve">, and K. </w:t>
-      </w:r>
-      <w:proofErr w:type="spellStart"/>
-      <w:r>
-        <w:rPr>
-          <w:rFonts w:cs="Times New Roman"/>
-        </w:rPr>
-        <w:t>Rutchey</w:t>
-      </w:r>
-      <w:proofErr w:type="spellEnd"/>
-      <w:r>
-        <w:rPr>
-          <w:rFonts w:cs="Times New Roman"/>
-        </w:rPr>
-        <w:t>. 2005. The ecological–societal underpinnings of Everglades restoration. Frontiers in Ecology and the Environment 3:161–169.</w:t>
+        <w:t>Sklar, F. H., M. J. Chimney, S. Newman, P. McCormick, D. Gawlik, S. Miao, C. McVoy, W. Said, J. Newman, C. Coronado, G. Crozier, M. Korvela, and K. Rutchey. 2005. The ecological–societal underpinnings of Everglades restoration. Frontiers in Ecology and the Environment 3:161–169.</w:t>
       </w:r>
     </w:p>
     <w:p>
@@ -12579,21 +11885,7 @@
           <w:rFonts w:cs="Times New Roman"/>
         </w:rPr>
         <w:lastRenderedPageBreak/>
-        <w:t>Valentine-Darby, P. L., S. E. Kell, and P. C. Darby. 2015. Predation on Florida apple snails (</w:t>
-      </w:r>
-      <w:proofErr w:type="spellStart"/>
-      <w:r>
-        <w:rPr>
-          <w:rFonts w:cs="Times New Roman"/>
-        </w:rPr>
-        <w:t>Pomacea</w:t>
-      </w:r>
-      <w:proofErr w:type="spellEnd"/>
-      <w:r>
-        <w:rPr>
-          <w:rFonts w:cs="Times New Roman"/>
-        </w:rPr>
-        <w:t xml:space="preserve"> paludosa) by native and non-native aquatic fauna, and predator-prey size relationships. Florida Scientist 78:47–56.</w:t>
+        <w:t>Valentine-Darby, P. L., S. E. Kell, and P. C. Darby. 2015. Predation on Florida apple snails (Pomacea paludosa) by native and non-native aquatic fauna, and predator-prey size relationships. Florida Scientist 78:47–56.</w:t>
       </w:r>
     </w:p>
     <w:p>
@@ -13419,13 +12711,8 @@
       </w:r>
       <w:bookmarkEnd w:id="9"/>
       <w:r>
-        <w:t>(snails &lt; 10mm SL</w:t>
-      </w:r>
-      <w:proofErr w:type="gramStart"/>
-      <w:r>
-        <w:t>)</w:t>
-      </w:r>
-      <w:proofErr w:type="gramEnd"/>
+        <w:t>(snails &lt; 10mm SL)</w:t>
+      </w:r>
       <w:r>
         <w:t xml:space="preserve"> and </w:t>
       </w:r>
@@ -14340,6 +13627,7 @@
   <w:style w:type="character" w:default="1" w:styleId="DefaultParagraphFont">
     <w:name w:val="Default Paragraph Font"/>
     <w:uiPriority w:val="1"/>
+    <w:semiHidden/>
     <w:unhideWhenUsed/>
   </w:style>
   <w:style w:type="table" w:default="1" w:styleId="TableNormal">

</xml_diff>